<commit_message>
Project risks and stakeholders re-uploaded
Fixed versions.
</commit_message>
<xml_diff>
--- a/SE216-Stakeholders.docx
+++ b/SE216-Stakeholders.docx
@@ -82,7 +82,7 @@
         <w:tc>
           <w:tcPr>
             <w:cnfStyle w:val="001000000000" w:firstRow="0" w:lastRow="0" w:firstColumn="1" w:lastColumn="0" w:oddVBand="0" w:evenVBand="0" w:oddHBand="0" w:evenHBand="0" w:firstRowFirstColumn="0" w:firstRowLastColumn="0" w:lastRowFirstColumn="0" w:lastRowLastColumn="0"/>
-            <w:tcW w:w="301" w:type="dxa"/>
+            <w:tcW w:w="460" w:type="dxa"/>
           </w:tcPr>
           <w:p>
             <w:pPr>
@@ -98,7 +98,7 @@
         </w:tc>
         <w:tc>
           <w:tcPr>
-            <w:tcW w:w="2010" w:type="dxa"/>
+            <w:tcW w:w="1991" w:type="dxa"/>
           </w:tcPr>
           <w:p>
             <w:pPr>
@@ -115,7 +115,7 @@
         </w:tc>
         <w:tc>
           <w:tcPr>
-            <w:tcW w:w="6899" w:type="dxa"/>
+            <w:tcW w:w="6609" w:type="dxa"/>
           </w:tcPr>
           <w:p>
             <w:pPr>
@@ -139,7 +139,7 @@
         <w:tc>
           <w:tcPr>
             <w:cnfStyle w:val="001000000000" w:firstRow="0" w:lastRow="0" w:firstColumn="1" w:lastColumn="0" w:oddVBand="0" w:evenVBand="0" w:oddHBand="0" w:evenHBand="0" w:firstRowFirstColumn="0" w:firstRowLastColumn="0" w:lastRowFirstColumn="0" w:lastRowLastColumn="0"/>
-            <w:tcW w:w="301" w:type="dxa"/>
+            <w:tcW w:w="460" w:type="dxa"/>
           </w:tcPr>
           <w:p>
             <w:r>
@@ -149,7 +149,23 @@
         </w:tc>
         <w:tc>
           <w:tcPr>
-            <w:tcW w:w="2010" w:type="dxa"/>
+            <w:tcW w:w="1991" w:type="dxa"/>
+          </w:tcPr>
+          <w:p>
+            <w:pPr>
+              <w:cnfStyle w:val="000000100000" w:firstRow="0" w:lastRow="0" w:firstColumn="0" w:lastColumn="0" w:oddVBand="0" w:evenVBand="0" w:oddHBand="1" w:evenHBand="0" w:firstRowFirstColumn="0" w:firstRowLastColumn="0" w:lastRowFirstColumn="0" w:lastRowLastColumn="0"/>
+            </w:pPr>
+            <w:r>
+              <w:t>Developer</w:t>
+            </w:r>
+            <w:r>
+              <w:t xml:space="preserve"> Team</w:t>
+            </w:r>
+          </w:p>
+        </w:tc>
+        <w:tc>
+          <w:tcPr>
+            <w:tcW w:w="6609" w:type="dxa"/>
           </w:tcPr>
           <w:p>
             <w:pPr>
@@ -157,20 +173,6 @@
               <w:cnfStyle w:val="000000100000" w:firstRow="0" w:lastRow="0" w:firstColumn="0" w:lastColumn="0" w:oddVBand="0" w:evenVBand="0" w:oddHBand="1" w:evenHBand="0" w:firstRowFirstColumn="0" w:firstRowLastColumn="0" w:lastRowFirstColumn="0" w:lastRowLastColumn="0"/>
             </w:pPr>
             <w:r>
-              <w:t>Developer</w:t>
-            </w:r>
-          </w:p>
-        </w:tc>
-        <w:tc>
-          <w:tcPr>
-            <w:tcW w:w="6899" w:type="dxa"/>
-          </w:tcPr>
-          <w:p>
-            <w:pPr>
-              <w:jc w:val="both"/>
-              <w:cnfStyle w:val="000000100000" w:firstRow="0" w:lastRow="0" w:firstColumn="0" w:lastColumn="0" w:oddVBand="0" w:evenVBand="0" w:oddHBand="1" w:evenHBand="0" w:firstRowFirstColumn="0" w:firstRowLastColumn="0" w:lastRowFirstColumn="0" w:lastRowLastColumn="0"/>
-            </w:pPr>
-            <w:r>
               <w:t>Developers</w:t>
             </w:r>
             <w:r>
@@ -334,17 +336,6 @@
             </w:r>
             <w:r>
               <w:t xml:space="preserve">hey </w:t>
-            </w:r>
-            <w:proofErr w:type="spellStart"/>
-            <w:r>
-              <w:t>t</w:t>
-            </w:r>
-            <w:r>
-              <w:t>hey</w:t>
-            </w:r>
-            <w:proofErr w:type="spellEnd"/>
-            <w:r>
-              <w:t xml:space="preserve"> </w:t>
             </w:r>
             <w:proofErr w:type="spellStart"/>
             <w:r>
@@ -402,7 +393,7 @@
         <w:tc>
           <w:tcPr>
             <w:cnfStyle w:val="001000000000" w:firstRow="0" w:lastRow="0" w:firstColumn="1" w:lastColumn="0" w:oddVBand="0" w:evenVBand="0" w:oddHBand="0" w:evenHBand="0" w:firstRowFirstColumn="0" w:firstRowLastColumn="0" w:lastRowFirstColumn="0" w:lastRowLastColumn="0"/>
-            <w:tcW w:w="301" w:type="dxa"/>
+            <w:tcW w:w="460" w:type="dxa"/>
           </w:tcPr>
           <w:p>
             <w:pPr>
@@ -415,21 +406,25 @@
         </w:tc>
         <w:tc>
           <w:tcPr>
-            <w:tcW w:w="2010" w:type="dxa"/>
+            <w:tcW w:w="1991" w:type="dxa"/>
           </w:tcPr>
           <w:p>
             <w:pPr>
-              <w:jc w:val="both"/>
               <w:cnfStyle w:val="000000000000" w:firstRow="0" w:lastRow="0" w:firstColumn="0" w:lastColumn="0" w:oddVBand="0" w:evenVBand="0" w:oddHBand="0" w:evenHBand="0" w:firstRowFirstColumn="0" w:firstRowLastColumn="0" w:lastRowFirstColumn="0" w:lastRowLastColumn="0"/>
             </w:pPr>
+            <w:proofErr w:type="spellStart"/>
             <w:r>
               <w:t>Customer</w:t>
             </w:r>
+            <w:r>
+              <w:t>s</w:t>
+            </w:r>
+            <w:proofErr w:type="spellEnd"/>
           </w:p>
         </w:tc>
         <w:tc>
           <w:tcPr>
-            <w:tcW w:w="6899" w:type="dxa"/>
+            <w:tcW w:w="6609" w:type="dxa"/>
           </w:tcPr>
           <w:p>
             <w:pPr>
@@ -798,7 +793,7 @@
         <w:tc>
           <w:tcPr>
             <w:cnfStyle w:val="001000000000" w:firstRow="0" w:lastRow="0" w:firstColumn="1" w:lastColumn="0" w:oddVBand="0" w:evenVBand="0" w:oddHBand="0" w:evenHBand="0" w:firstRowFirstColumn="0" w:firstRowLastColumn="0" w:lastRowFirstColumn="0" w:lastRowLastColumn="0"/>
-            <w:tcW w:w="301" w:type="dxa"/>
+            <w:tcW w:w="460" w:type="dxa"/>
           </w:tcPr>
           <w:p>
             <w:pPr>
@@ -811,11 +806,10 @@
         </w:tc>
         <w:tc>
           <w:tcPr>
-            <w:tcW w:w="2010" w:type="dxa"/>
+            <w:tcW w:w="1991" w:type="dxa"/>
           </w:tcPr>
           <w:p>
             <w:pPr>
-              <w:jc w:val="both"/>
               <w:cnfStyle w:val="000000100000" w:firstRow="0" w:lastRow="0" w:firstColumn="0" w:lastColumn="0" w:oddVBand="0" w:evenVBand="0" w:oddHBand="1" w:evenHBand="0" w:firstRowFirstColumn="0" w:firstRowLastColumn="0" w:lastRowFirstColumn="0" w:lastRowLastColumn="0"/>
             </w:pPr>
             <w:r>
@@ -825,7 +819,7 @@
         </w:tc>
         <w:tc>
           <w:tcPr>
-            <w:tcW w:w="6899" w:type="dxa"/>
+            <w:tcW w:w="6609" w:type="dxa"/>
           </w:tcPr>
           <w:p>
             <w:pPr>
@@ -1007,7 +1001,7 @@
         <w:tc>
           <w:tcPr>
             <w:cnfStyle w:val="001000000000" w:firstRow="0" w:lastRow="0" w:firstColumn="1" w:lastColumn="0" w:oddVBand="0" w:evenVBand="0" w:oddHBand="0" w:evenHBand="0" w:firstRowFirstColumn="0" w:firstRowLastColumn="0" w:lastRowFirstColumn="0" w:lastRowLastColumn="0"/>
-            <w:tcW w:w="301" w:type="dxa"/>
+            <w:tcW w:w="460" w:type="dxa"/>
           </w:tcPr>
           <w:p>
             <w:pPr>
@@ -1020,7 +1014,39 @@
         </w:tc>
         <w:tc>
           <w:tcPr>
-            <w:tcW w:w="2010" w:type="dxa"/>
+            <w:tcW w:w="1991" w:type="dxa"/>
+          </w:tcPr>
+          <w:p>
+            <w:pPr>
+              <w:cnfStyle w:val="000000000000" w:firstRow="0" w:lastRow="0" w:firstColumn="0" w:lastColumn="0" w:oddVBand="0" w:evenVBand="0" w:oddHBand="0" w:evenHBand="0" w:firstRowFirstColumn="0" w:firstRowLastColumn="0" w:lastRowFirstColumn="0" w:lastRowLastColumn="0"/>
+            </w:pPr>
+            <w:r>
+              <w:t>Bank</w:t>
+            </w:r>
+            <w:r>
+              <w:t xml:space="preserve"> </w:t>
+            </w:r>
+            <w:proofErr w:type="spellStart"/>
+            <w:r>
+              <w:t>and</w:t>
+            </w:r>
+            <w:proofErr w:type="spellEnd"/>
+            <w:r>
+              <w:t xml:space="preserve"> </w:t>
+            </w:r>
+            <w:proofErr w:type="spellStart"/>
+            <w:r>
+              <w:t>Paygate</w:t>
+            </w:r>
+            <w:proofErr w:type="spellEnd"/>
+            <w:r>
+              <w:t xml:space="preserve"> Providers</w:t>
+            </w:r>
+          </w:p>
+        </w:tc>
+        <w:tc>
+          <w:tcPr>
+            <w:tcW w:w="6609" w:type="dxa"/>
           </w:tcPr>
           <w:p>
             <w:pPr>
@@ -1028,40 +1054,39 @@
               <w:cnfStyle w:val="000000000000" w:firstRow="0" w:lastRow="0" w:firstColumn="0" w:lastColumn="0" w:oddVBand="0" w:evenVBand="0" w:oddHBand="0" w:evenHBand="0" w:firstRowFirstColumn="0" w:firstRowLastColumn="0" w:lastRowFirstColumn="0" w:lastRowLastColumn="0"/>
             </w:pPr>
             <w:r>
-              <w:t>Bank</w:t>
-            </w:r>
-            <w:r>
-              <w:t xml:space="preserve"> </w:t>
-            </w:r>
-            <w:proofErr w:type="spellStart"/>
-            <w:r>
-              <w:t>and</w:t>
-            </w:r>
-            <w:proofErr w:type="spellEnd"/>
-            <w:r>
-              <w:t xml:space="preserve"> </w:t>
-            </w:r>
-            <w:proofErr w:type="spellStart"/>
-            <w:r>
-              <w:t>Paygate</w:t>
-            </w:r>
-            <w:proofErr w:type="spellEnd"/>
-            <w:r>
-              <w:t xml:space="preserve"> Providers</w:t>
-            </w:r>
-          </w:p>
-        </w:tc>
-        <w:tc>
-          <w:tcPr>
-            <w:tcW w:w="6899" w:type="dxa"/>
-          </w:tcPr>
-          <w:p>
-            <w:pPr>
-              <w:jc w:val="both"/>
-              <w:cnfStyle w:val="000000000000" w:firstRow="0" w:lastRow="0" w:firstColumn="0" w:lastColumn="0" w:oddVBand="0" w:evenVBand="0" w:oddHBand="0" w:evenHBand="0" w:firstRowFirstColumn="0" w:firstRowLastColumn="0" w:lastRowFirstColumn="0" w:lastRowLastColumn="0"/>
-            </w:pPr>
-            <w:r>
-              <w:t xml:space="preserve">They provide the infrastructure for secure escrow and financial transfers. If project successful: They process high </w:t>
+              <w:t xml:space="preserve">They provide the infrastructure for secure escrow and financial transfers. If </w:t>
+            </w:r>
+            <w:proofErr w:type="spellStart"/>
+            <w:r>
+              <w:t>project</w:t>
+            </w:r>
+            <w:proofErr w:type="spellEnd"/>
+            <w:r>
+              <w:t xml:space="preserve"> </w:t>
+            </w:r>
+            <w:proofErr w:type="spellStart"/>
+            <w:r>
+              <w:t>successful</w:t>
+            </w:r>
+            <w:proofErr w:type="spellEnd"/>
+            <w:r>
+              <w:t xml:space="preserve">: They </w:t>
+            </w:r>
+            <w:proofErr w:type="spellStart"/>
+            <w:r>
+              <w:t>process</w:t>
+            </w:r>
+            <w:proofErr w:type="spellEnd"/>
+            <w:r>
+              <w:t xml:space="preserve"> </w:t>
+            </w:r>
+            <w:proofErr w:type="spellStart"/>
+            <w:r>
+              <w:t>high</w:t>
+            </w:r>
+            <w:proofErr w:type="spellEnd"/>
+            <w:r>
+              <w:t xml:space="preserve"> </w:t>
             </w:r>
             <w:proofErr w:type="spellStart"/>
             <w:r>
@@ -1128,7 +1153,7 @@
         <w:tc>
           <w:tcPr>
             <w:cnfStyle w:val="001000000000" w:firstRow="0" w:lastRow="0" w:firstColumn="1" w:lastColumn="0" w:oddVBand="0" w:evenVBand="0" w:oddHBand="0" w:evenHBand="0" w:firstRowFirstColumn="0" w:firstRowLastColumn="0" w:lastRowFirstColumn="0" w:lastRowLastColumn="0"/>
-            <w:tcW w:w="301" w:type="dxa"/>
+            <w:tcW w:w="460" w:type="dxa"/>
           </w:tcPr>
           <w:p>
             <w:pPr>
@@ -1141,11 +1166,10 @@
         </w:tc>
         <w:tc>
           <w:tcPr>
-            <w:tcW w:w="2010" w:type="dxa"/>
+            <w:tcW w:w="1991" w:type="dxa"/>
           </w:tcPr>
           <w:p>
             <w:pPr>
-              <w:jc w:val="both"/>
               <w:cnfStyle w:val="000000100000" w:firstRow="0" w:lastRow="0" w:firstColumn="0" w:lastColumn="0" w:oddVBand="0" w:evenVBand="0" w:oddHBand="1" w:evenHBand="0" w:firstRowFirstColumn="0" w:firstRowLastColumn="0" w:lastRowFirstColumn="0" w:lastRowLastColumn="0"/>
             </w:pPr>
             <w:proofErr w:type="spellStart"/>
@@ -1176,7 +1200,7 @@
         </w:tc>
         <w:tc>
           <w:tcPr>
-            <w:tcW w:w="6899" w:type="dxa"/>
+            <w:tcW w:w="6609" w:type="dxa"/>
           </w:tcPr>
           <w:p>
             <w:pPr>
@@ -1452,12 +1476,12 @@
       </w:tr>
       <w:tr>
         <w:trPr>
-          <w:trHeight w:val="657"/>
+          <w:trHeight w:val="58"/>
         </w:trPr>
         <w:tc>
           <w:tcPr>
             <w:cnfStyle w:val="001000000000" w:firstRow="0" w:lastRow="0" w:firstColumn="1" w:lastColumn="0" w:oddVBand="0" w:evenVBand="0" w:oddHBand="0" w:evenHBand="0" w:firstRowFirstColumn="0" w:firstRowLastColumn="0" w:lastRowFirstColumn="0" w:lastRowLastColumn="0"/>
-            <w:tcW w:w="301" w:type="dxa"/>
+            <w:tcW w:w="460" w:type="dxa"/>
           </w:tcPr>
           <w:p>
             <w:pPr>
@@ -1470,7 +1494,31 @@
         </w:tc>
         <w:tc>
           <w:tcPr>
-            <w:tcW w:w="2010" w:type="dxa"/>
+            <w:tcW w:w="1991" w:type="dxa"/>
+          </w:tcPr>
+          <w:p>
+            <w:pPr>
+              <w:cnfStyle w:val="000000000000" w:firstRow="0" w:lastRow="0" w:firstColumn="0" w:lastColumn="0" w:oddVBand="0" w:evenVBand="0" w:oddHBand="0" w:evenHBand="0" w:firstRowFirstColumn="0" w:firstRowLastColumn="0" w:lastRowFirstColumn="0" w:lastRowLastColumn="0"/>
+            </w:pPr>
+            <w:r>
+              <w:t xml:space="preserve">T.C. </w:t>
+            </w:r>
+            <w:proofErr w:type="spellStart"/>
+            <w:r>
+              <w:t>Ministry</w:t>
+            </w:r>
+            <w:proofErr w:type="spellEnd"/>
+            <w:r>
+              <w:t xml:space="preserve"> </w:t>
+            </w:r>
+            <w:r>
+              <w:t>of Commerce</w:t>
+            </w:r>
+          </w:p>
+        </w:tc>
+        <w:tc>
+          <w:tcPr>
+            <w:tcW w:w="6609" w:type="dxa"/>
           </w:tcPr>
           <w:p>
             <w:pPr>
@@ -1478,25 +1526,131 @@
               <w:cnfStyle w:val="000000000000" w:firstRow="0" w:lastRow="0" w:firstColumn="0" w:lastColumn="0" w:oddVBand="0" w:evenVBand="0" w:oddHBand="0" w:evenHBand="0" w:firstRowFirstColumn="0" w:firstRowLastColumn="0" w:lastRowFirstColumn="0" w:lastRowLastColumn="0"/>
             </w:pPr>
             <w:r>
-              <w:t>Project Manager</w:t>
-            </w:r>
-          </w:p>
-        </w:tc>
-        <w:tc>
-          <w:tcPr>
-            <w:tcW w:w="6899" w:type="dxa"/>
-          </w:tcPr>
-          <w:p>
-            <w:pPr>
-              <w:jc w:val="both"/>
-              <w:cnfStyle w:val="000000000000" w:firstRow="0" w:lastRow="0" w:firstColumn="0" w:lastColumn="0" w:oddVBand="0" w:evenVBand="0" w:oddHBand="0" w:evenHBand="0" w:firstRowFirstColumn="0" w:firstRowLastColumn="0" w:lastRowFirstColumn="0" w:lastRowLastColumn="0"/>
-            </w:pPr>
-            <w:r>
-              <w:t xml:space="preserve">They organize the development team and manage the project timeline. </w:t>
-            </w:r>
-            <w:proofErr w:type="spellStart"/>
-            <w:r>
-              <w:t>If</w:t>
+              <w:t xml:space="preserve">They </w:t>
+            </w:r>
+            <w:proofErr w:type="spellStart"/>
+            <w:r>
+              <w:t>establish</w:t>
+            </w:r>
+            <w:proofErr w:type="spellEnd"/>
+            <w:r>
+              <w:t xml:space="preserve"> </w:t>
+            </w:r>
+            <w:proofErr w:type="spellStart"/>
+            <w:r>
+              <w:t>the</w:t>
+            </w:r>
+            <w:proofErr w:type="spellEnd"/>
+            <w:r>
+              <w:t xml:space="preserve"> legal </w:t>
+            </w:r>
+            <w:proofErr w:type="spellStart"/>
+            <w:r>
+              <w:t>framework</w:t>
+            </w:r>
+            <w:proofErr w:type="spellEnd"/>
+            <w:r>
+              <w:t xml:space="preserve"> </w:t>
+            </w:r>
+            <w:proofErr w:type="spellStart"/>
+            <w:r>
+              <w:t>for</w:t>
+            </w:r>
+            <w:proofErr w:type="spellEnd"/>
+            <w:r>
+              <w:t xml:space="preserve"> data </w:t>
+            </w:r>
+            <w:proofErr w:type="spellStart"/>
+            <w:r>
+              <w:t>privacy</w:t>
+            </w:r>
+            <w:proofErr w:type="spellEnd"/>
+            <w:r>
+              <w:t xml:space="preserve"> </w:t>
+            </w:r>
+            <w:proofErr w:type="spellStart"/>
+            <w:r>
+              <w:t>and</w:t>
+            </w:r>
+            <w:proofErr w:type="spellEnd"/>
+            <w:r>
+              <w:t xml:space="preserve"> </w:t>
+            </w:r>
+            <w:proofErr w:type="spellStart"/>
+            <w:r>
+              <w:t>commerce</w:t>
+            </w:r>
+            <w:proofErr w:type="spellEnd"/>
+            <w:r>
+              <w:t xml:space="preserve">, </w:t>
+            </w:r>
+            <w:proofErr w:type="spellStart"/>
+            <w:r>
+              <w:t>which</w:t>
+            </w:r>
+            <w:proofErr w:type="spellEnd"/>
+            <w:r>
+              <w:t xml:space="preserve"> </w:t>
+            </w:r>
+            <w:proofErr w:type="spellStart"/>
+            <w:r>
+              <w:t>affects</w:t>
+            </w:r>
+            <w:proofErr w:type="spellEnd"/>
+            <w:r>
+              <w:t xml:space="preserve"> </w:t>
+            </w:r>
+            <w:proofErr w:type="spellStart"/>
+            <w:r>
+              <w:t>the</w:t>
+            </w:r>
+            <w:proofErr w:type="spellEnd"/>
+            <w:r>
+              <w:t xml:space="preserve"> </w:t>
+            </w:r>
+            <w:proofErr w:type="spellStart"/>
+            <w:r>
+              <w:t>structure</w:t>
+            </w:r>
+            <w:proofErr w:type="spellEnd"/>
+            <w:r>
+              <w:t xml:space="preserve"> of </w:t>
+            </w:r>
+            <w:proofErr w:type="spellStart"/>
+            <w:r>
+              <w:t>the</w:t>
+            </w:r>
+            <w:proofErr w:type="spellEnd"/>
+            <w:r>
+              <w:t xml:space="preserve"> software. The </w:t>
+            </w:r>
+            <w:proofErr w:type="spellStart"/>
+            <w:r>
+              <w:t>success</w:t>
+            </w:r>
+            <w:proofErr w:type="spellEnd"/>
+            <w:r>
+              <w:t xml:space="preserve"> </w:t>
+            </w:r>
+            <w:proofErr w:type="spellStart"/>
+            <w:r>
+              <w:t>and</w:t>
+            </w:r>
+            <w:proofErr w:type="spellEnd"/>
+            <w:r>
+              <w:t xml:space="preserve"> </w:t>
+            </w:r>
+            <w:proofErr w:type="spellStart"/>
+            <w:r>
+              <w:t>failure</w:t>
+            </w:r>
+            <w:proofErr w:type="spellEnd"/>
+            <w:r>
+              <w:t xml:space="preserve"> of </w:t>
+            </w:r>
+            <w:proofErr w:type="spellStart"/>
+            <w:r>
+              <w:t>the</w:t>
             </w:r>
             <w:proofErr w:type="spellEnd"/>
             <w:r>
@@ -1510,146 +1664,41 @@
             <w:r>
               <w:t xml:space="preserve"> </w:t>
             </w:r>
-            <w:r>
-              <w:t xml:space="preserve">is </w:t>
-            </w:r>
-            <w:proofErr w:type="spellStart"/>
-            <w:r>
-              <w:t>successful</w:t>
-            </w:r>
-            <w:proofErr w:type="spellEnd"/>
-            <w:r>
-              <w:t xml:space="preserve"> they</w:t>
-            </w:r>
-            <w:r>
-              <w:t xml:space="preserve"> </w:t>
-            </w:r>
-            <w:proofErr w:type="spellStart"/>
-            <w:r>
-              <w:t>will</w:t>
-            </w:r>
-            <w:proofErr w:type="spellEnd"/>
-            <w:r>
-              <w:t xml:space="preserve"> </w:t>
-            </w:r>
-            <w:proofErr w:type="spellStart"/>
-            <w:r>
-              <w:t>prove</w:t>
-            </w:r>
-            <w:proofErr w:type="spellEnd"/>
-            <w:r>
-              <w:t xml:space="preserve"> </w:t>
-            </w:r>
-            <w:proofErr w:type="spellStart"/>
-            <w:r>
-              <w:t>their</w:t>
-            </w:r>
-            <w:proofErr w:type="spellEnd"/>
-            <w:r>
-              <w:t xml:space="preserve"> </w:t>
-            </w:r>
-            <w:proofErr w:type="spellStart"/>
-            <w:r>
-              <w:t>leadership</w:t>
-            </w:r>
-            <w:proofErr w:type="spellEnd"/>
-            <w:r>
-              <w:t xml:space="preserve"> </w:t>
-            </w:r>
-            <w:proofErr w:type="spellStart"/>
-            <w:r>
-              <w:t>skills</w:t>
-            </w:r>
-            <w:proofErr w:type="spellEnd"/>
-            <w:r>
-              <w:t xml:space="preserve"> </w:t>
-            </w:r>
-            <w:proofErr w:type="spellStart"/>
-            <w:r>
-              <w:t>and</w:t>
-            </w:r>
-            <w:proofErr w:type="spellEnd"/>
-            <w:r>
-              <w:t xml:space="preserve"> </w:t>
-            </w:r>
-            <w:proofErr w:type="spellStart"/>
-            <w:r>
-              <w:t>enhance</w:t>
-            </w:r>
-            <w:proofErr w:type="spellEnd"/>
-            <w:r>
-              <w:t xml:space="preserve"> </w:t>
-            </w:r>
-            <w:proofErr w:type="spellStart"/>
-            <w:r>
-              <w:t>their</w:t>
-            </w:r>
-            <w:proofErr w:type="spellEnd"/>
-            <w:r>
-              <w:t xml:space="preserve"> professional resumes. </w:t>
-            </w:r>
-            <w:proofErr w:type="spellStart"/>
-            <w:r>
-              <w:t>If</w:t>
-            </w:r>
-            <w:proofErr w:type="spellEnd"/>
-            <w:r>
-              <w:t xml:space="preserve"> </w:t>
-            </w:r>
-            <w:proofErr w:type="spellStart"/>
-            <w:r>
-              <w:t>project</w:t>
-            </w:r>
-            <w:proofErr w:type="spellEnd"/>
-            <w:r>
-              <w:t xml:space="preserve"> </w:t>
-            </w:r>
-            <w:proofErr w:type="spellStart"/>
-            <w:r>
-              <w:t>fails</w:t>
-            </w:r>
-            <w:proofErr w:type="spellEnd"/>
-            <w:r>
-              <w:t xml:space="preserve"> they</w:t>
-            </w:r>
-            <w:r>
-              <w:t xml:space="preserve"> </w:t>
-            </w:r>
-            <w:proofErr w:type="spellStart"/>
-            <w:r>
-              <w:t>will</w:t>
-            </w:r>
-            <w:proofErr w:type="spellEnd"/>
-            <w:r>
-              <w:t xml:space="preserve"> </w:t>
-            </w:r>
-            <w:proofErr w:type="spellStart"/>
-            <w:r>
-              <w:t>lose</w:t>
-            </w:r>
-            <w:proofErr w:type="spellEnd"/>
-            <w:r>
-              <w:t xml:space="preserve"> </w:t>
-            </w:r>
-            <w:proofErr w:type="spellStart"/>
-            <w:r>
-              <w:t>credibility</w:t>
-            </w:r>
-            <w:proofErr w:type="spellEnd"/>
-            <w:r>
-              <w:t xml:space="preserve"> in </w:t>
-            </w:r>
-            <w:proofErr w:type="spellStart"/>
-            <w:r>
-              <w:t>their</w:t>
-            </w:r>
-            <w:proofErr w:type="spellEnd"/>
-            <w:r>
-              <w:t xml:space="preserve"> </w:t>
-            </w:r>
-            <w:proofErr w:type="spellStart"/>
-            <w:r>
-              <w:t>position</w:t>
+            <w:proofErr w:type="spellStart"/>
+            <w:r>
+              <w:t>wouldn’t</w:t>
+            </w:r>
+            <w:proofErr w:type="spellEnd"/>
+            <w:r>
+              <w:t xml:space="preserve"> </w:t>
+            </w:r>
+            <w:proofErr w:type="spellStart"/>
+            <w:r>
+              <w:t>directly</w:t>
+            </w:r>
+            <w:proofErr w:type="spellEnd"/>
+            <w:r>
+              <w:t xml:space="preserve"> </w:t>
+            </w:r>
+            <w:proofErr w:type="spellStart"/>
+            <w:r>
+              <w:t>affect</w:t>
+            </w:r>
+            <w:proofErr w:type="spellEnd"/>
+            <w:r>
+              <w:t xml:space="preserve"> </w:t>
+            </w:r>
+            <w:proofErr w:type="spellStart"/>
+            <w:r>
+              <w:t>the</w:t>
+            </w:r>
+            <w:proofErr w:type="spellEnd"/>
+            <w:r>
+              <w:t xml:space="preserve"> </w:t>
+            </w:r>
+            <w:proofErr w:type="spellStart"/>
+            <w:r>
+              <w:t>government</w:t>
             </w:r>
             <w:proofErr w:type="spellEnd"/>
             <w:r>
@@ -1672,7 +1721,7 @@
         <w:tc>
           <w:tcPr>
             <w:cnfStyle w:val="001000000000" w:firstRow="0" w:lastRow="0" w:firstColumn="1" w:lastColumn="0" w:oddVBand="0" w:evenVBand="0" w:oddHBand="0" w:evenHBand="0" w:firstRowFirstColumn="0" w:firstRowLastColumn="0" w:lastRowFirstColumn="0" w:lastRowLastColumn="0"/>
-            <w:tcW w:w="301" w:type="dxa"/>
+            <w:tcW w:w="460" w:type="dxa"/>
           </w:tcPr>
           <w:p>
             <w:pPr>
@@ -1685,7 +1734,30 @@
         </w:tc>
         <w:tc>
           <w:tcPr>
-            <w:tcW w:w="2010" w:type="dxa"/>
+            <w:tcW w:w="1991" w:type="dxa"/>
+          </w:tcPr>
+          <w:p>
+            <w:pPr>
+              <w:cnfStyle w:val="000000100000" w:firstRow="0" w:lastRow="0" w:firstColumn="0" w:lastColumn="0" w:oddVBand="0" w:evenVBand="0" w:oddHBand="1" w:evenHBand="0" w:firstRowFirstColumn="0" w:firstRowLastColumn="0" w:lastRowFirstColumn="0" w:lastRowLastColumn="0"/>
+            </w:pPr>
+            <w:proofErr w:type="spellStart"/>
+            <w:proofErr w:type="gramStart"/>
+            <w:r>
+              <w:t>Buyer</w:t>
+            </w:r>
+            <w:proofErr w:type="spellEnd"/>
+            <w:r>
+              <w:t>(</w:t>
+            </w:r>
+            <w:proofErr w:type="gramEnd"/>
+            <w:r>
+              <w:t>CEO)</w:t>
+            </w:r>
+          </w:p>
+        </w:tc>
+        <w:tc>
+          <w:tcPr>
+            <w:tcW w:w="6609" w:type="dxa"/>
           </w:tcPr>
           <w:p>
             <w:pPr>
@@ -1693,41 +1765,27 @@
               <w:cnfStyle w:val="000000100000" w:firstRow="0" w:lastRow="0" w:firstColumn="0" w:lastColumn="0" w:oddVBand="0" w:evenVBand="0" w:oddHBand="1" w:evenHBand="0" w:firstRowFirstColumn="0" w:firstRowLastColumn="0" w:lastRowFirstColumn="0" w:lastRowLastColumn="0"/>
             </w:pPr>
             <w:r>
-              <w:t>Government</w:t>
-            </w:r>
-          </w:p>
-        </w:tc>
-        <w:tc>
-          <w:tcPr>
-            <w:tcW w:w="6899" w:type="dxa"/>
-          </w:tcPr>
-          <w:p>
-            <w:pPr>
-              <w:jc w:val="both"/>
-              <w:cnfStyle w:val="000000100000" w:firstRow="0" w:lastRow="0" w:firstColumn="0" w:lastColumn="0" w:oddVBand="0" w:evenVBand="0" w:oddHBand="1" w:evenHBand="0" w:firstRowFirstColumn="0" w:firstRowLastColumn="0" w:lastRowFirstColumn="0" w:lastRowLastColumn="0"/>
-            </w:pPr>
-            <w:r>
-              <w:t xml:space="preserve">They establish the legal </w:t>
-            </w:r>
-            <w:proofErr w:type="spellStart"/>
-            <w:r>
-              <w:t>framework</w:t>
-            </w:r>
-            <w:proofErr w:type="spellEnd"/>
-            <w:r>
-              <w:t xml:space="preserve"> </w:t>
-            </w:r>
-            <w:proofErr w:type="spellStart"/>
-            <w:r>
-              <w:t>for</w:t>
-            </w:r>
-            <w:proofErr w:type="spellEnd"/>
-            <w:r>
-              <w:t xml:space="preserve"> data </w:t>
-            </w:r>
-            <w:proofErr w:type="spellStart"/>
-            <w:r>
-              <w:t>privacy</w:t>
+              <w:t xml:space="preserve">They define </w:t>
+            </w:r>
+            <w:proofErr w:type="spellStart"/>
+            <w:r>
+              <w:t>the</w:t>
+            </w:r>
+            <w:proofErr w:type="spellEnd"/>
+            <w:r>
+              <w:t xml:space="preserve"> </w:t>
+            </w:r>
+            <w:proofErr w:type="spellStart"/>
+            <w:r>
+              <w:t>core</w:t>
+            </w:r>
+            <w:proofErr w:type="spellEnd"/>
+            <w:r>
+              <w:t xml:space="preserve"> </w:t>
+            </w:r>
+            <w:proofErr w:type="spellStart"/>
+            <w:r>
+              <w:t>vision</w:t>
             </w:r>
             <w:proofErr w:type="spellEnd"/>
             <w:r>
@@ -1743,14 +1801,59 @@
             </w:r>
             <w:proofErr w:type="spellStart"/>
             <w:r>
-              <w:t>commerce</w:t>
-            </w:r>
-            <w:proofErr w:type="spellEnd"/>
-            <w:r>
-              <w:t>.</w:t>
-            </w:r>
-            <w:r>
-              <w:t xml:space="preserve"> The </w:t>
+              <w:t>the</w:t>
+            </w:r>
+            <w:proofErr w:type="spellEnd"/>
+            <w:r>
+              <w:t xml:space="preserve"> </w:t>
+            </w:r>
+            <w:proofErr w:type="spellStart"/>
+            <w:r>
+              <w:t>requirements</w:t>
+            </w:r>
+            <w:proofErr w:type="spellEnd"/>
+            <w:r>
+              <w:t xml:space="preserve"> of </w:t>
+            </w:r>
+            <w:proofErr w:type="spellStart"/>
+            <w:r>
+              <w:t>the</w:t>
+            </w:r>
+            <w:proofErr w:type="spellEnd"/>
+            <w:r>
+              <w:t xml:space="preserve"> </w:t>
+            </w:r>
+            <w:proofErr w:type="spellStart"/>
+            <w:r>
+              <w:t>project</w:t>
+            </w:r>
+            <w:proofErr w:type="spellEnd"/>
+            <w:r>
+              <w:t xml:space="preserve">. </w:t>
+            </w:r>
+            <w:proofErr w:type="spellStart"/>
+            <w:r>
+              <w:t>If</w:t>
+            </w:r>
+            <w:proofErr w:type="spellEnd"/>
+            <w:r>
+              <w:t xml:space="preserve"> </w:t>
+            </w:r>
+            <w:proofErr w:type="spellStart"/>
+            <w:r>
+              <w:t>project</w:t>
+            </w:r>
+            <w:proofErr w:type="spellEnd"/>
+            <w:r>
+              <w:t xml:space="preserve"> </w:t>
+            </w:r>
+            <w:proofErr w:type="spellStart"/>
+            <w:r>
+              <w:t>results</w:t>
+            </w:r>
+            <w:proofErr w:type="spellEnd"/>
+            <w:r>
+              <w:t xml:space="preserve"> in </w:t>
             </w:r>
             <w:proofErr w:type="spellStart"/>
             <w:r>
@@ -1760,17 +1863,152 @@
             <w:r>
               <w:t xml:space="preserve"> </w:t>
             </w:r>
+            <w:r>
+              <w:t>t</w:t>
+            </w:r>
+            <w:r>
+              <w:t xml:space="preserve">hey </w:t>
+            </w:r>
+            <w:proofErr w:type="spellStart"/>
+            <w:r>
+              <w:t>will</w:t>
+            </w:r>
+            <w:proofErr w:type="spellEnd"/>
+            <w:r>
+              <w:t xml:space="preserve"> </w:t>
+            </w:r>
+            <w:proofErr w:type="spellStart"/>
+            <w:r>
+              <w:t>own</w:t>
+            </w:r>
+            <w:proofErr w:type="spellEnd"/>
+            <w:r>
+              <w:t xml:space="preserve"> a </w:t>
+            </w:r>
+            <w:proofErr w:type="spellStart"/>
+            <w:r>
+              <w:t>profitable</w:t>
+            </w:r>
+            <w:proofErr w:type="spellEnd"/>
+            <w:r>
+              <w:t xml:space="preserve"> </w:t>
+            </w:r>
+            <w:r>
+              <w:t xml:space="preserve">platform </w:t>
+            </w:r>
             <w:proofErr w:type="spellStart"/>
             <w:r>
               <w:t>and</w:t>
             </w:r>
             <w:proofErr w:type="spellEnd"/>
             <w:r>
-              <w:t xml:space="preserve"> </w:t>
-            </w:r>
-            <w:proofErr w:type="spellStart"/>
-            <w:r>
-              <w:t>failure</w:t>
+              <w:t xml:space="preserve"> a </w:t>
+            </w:r>
+            <w:proofErr w:type="spellStart"/>
+            <w:r>
+              <w:t>unique</w:t>
+            </w:r>
+            <w:proofErr w:type="spellEnd"/>
+            <w:r>
+              <w:t xml:space="preserve"> </w:t>
+            </w:r>
+            <w:proofErr w:type="spellStart"/>
+            <w:r>
+              <w:t>business</w:t>
+            </w:r>
+            <w:proofErr w:type="spellEnd"/>
+            <w:r>
+              <w:t xml:space="preserve"> model. </w:t>
+            </w:r>
+            <w:proofErr w:type="spellStart"/>
+            <w:r>
+              <w:t>If</w:t>
+            </w:r>
+            <w:proofErr w:type="spellEnd"/>
+            <w:r>
+              <w:t xml:space="preserve"> </w:t>
+            </w:r>
+            <w:proofErr w:type="spellStart"/>
+            <w:r>
+              <w:t>project</w:t>
+            </w:r>
+            <w:proofErr w:type="spellEnd"/>
+            <w:r>
+              <w:t xml:space="preserve"> </w:t>
+            </w:r>
+            <w:proofErr w:type="spellStart"/>
+            <w:r>
+              <w:t>fails</w:t>
+            </w:r>
+            <w:proofErr w:type="spellEnd"/>
+            <w:r>
+              <w:t xml:space="preserve"> t</w:t>
+            </w:r>
+            <w:r>
+              <w:t>hey</w:t>
+            </w:r>
+            <w:r>
+              <w:t xml:space="preserve"> </w:t>
+            </w:r>
+            <w:proofErr w:type="spellStart"/>
+            <w:r>
+              <w:t>will</w:t>
+            </w:r>
+            <w:proofErr w:type="spellEnd"/>
+            <w:r>
+              <w:t xml:space="preserve"> </w:t>
+            </w:r>
+            <w:proofErr w:type="spellStart"/>
+            <w:r>
+              <w:t>lose</w:t>
+            </w:r>
+            <w:proofErr w:type="spellEnd"/>
+            <w:r>
+              <w:t xml:space="preserve"> </w:t>
+            </w:r>
+            <w:proofErr w:type="spellStart"/>
+            <w:r>
+              <w:t>their</w:t>
+            </w:r>
+            <w:proofErr w:type="spellEnd"/>
+            <w:r>
+              <w:t xml:space="preserve"> </w:t>
+            </w:r>
+            <w:proofErr w:type="spellStart"/>
+            <w:r>
+              <w:t>competitive</w:t>
+            </w:r>
+            <w:proofErr w:type="spellEnd"/>
+            <w:r>
+              <w:t xml:space="preserve"> </w:t>
+            </w:r>
+            <w:proofErr w:type="spellStart"/>
+            <w:r>
+              <w:t>advantage</w:t>
+            </w:r>
+            <w:proofErr w:type="spellEnd"/>
+            <w:r>
+              <w:t xml:space="preserve"> </w:t>
+            </w:r>
+            <w:proofErr w:type="spellStart"/>
+            <w:r>
+              <w:t>and</w:t>
+            </w:r>
+            <w:proofErr w:type="spellEnd"/>
+            <w:r>
+              <w:t xml:space="preserve"> </w:t>
+            </w:r>
+            <w:proofErr w:type="spellStart"/>
+            <w:r>
+              <w:t>the</w:t>
+            </w:r>
+            <w:proofErr w:type="spellEnd"/>
+            <w:r>
+              <w:t xml:space="preserve"> </w:t>
+            </w:r>
+            <w:proofErr w:type="spellStart"/>
+            <w:r>
+              <w:t>value</w:t>
             </w:r>
             <w:proofErr w:type="spellEnd"/>
             <w:r>
@@ -1778,59 +2016,11 @@
             </w:r>
             <w:proofErr w:type="spellStart"/>
             <w:r>
-              <w:t>the</w:t>
-            </w:r>
-            <w:proofErr w:type="spellEnd"/>
-            <w:r>
-              <w:t xml:space="preserve"> </w:t>
-            </w:r>
-            <w:proofErr w:type="spellStart"/>
-            <w:r>
-              <w:t>project</w:t>
-            </w:r>
-            <w:proofErr w:type="spellEnd"/>
-            <w:r>
-              <w:t xml:space="preserve"> </w:t>
-            </w:r>
-            <w:proofErr w:type="spellStart"/>
-            <w:r>
-              <w:t>wouldn’t</w:t>
-            </w:r>
-            <w:proofErr w:type="spellEnd"/>
-            <w:r>
-              <w:t xml:space="preserve"> </w:t>
-            </w:r>
-            <w:proofErr w:type="spellStart"/>
-            <w:r>
-              <w:t>directly</w:t>
-            </w:r>
-            <w:proofErr w:type="spellEnd"/>
-            <w:r>
-              <w:t xml:space="preserve"> </w:t>
-            </w:r>
-            <w:proofErr w:type="spellStart"/>
-            <w:r>
-              <w:t>affect</w:t>
-            </w:r>
-            <w:proofErr w:type="spellEnd"/>
-            <w:r>
-              <w:t xml:space="preserve"> </w:t>
-            </w:r>
-            <w:proofErr w:type="spellStart"/>
-            <w:r>
-              <w:t>the</w:t>
-            </w:r>
-            <w:proofErr w:type="spellEnd"/>
-            <w:r>
-              <w:t xml:space="preserve"> </w:t>
-            </w:r>
-            <w:proofErr w:type="spellStart"/>
-            <w:r>
-              <w:t>government</w:t>
-            </w:r>
-            <w:proofErr w:type="spellEnd"/>
-            <w:r>
-              <w:t>.</w:t>
+              <w:t>their</w:t>
+            </w:r>
+            <w:proofErr w:type="spellEnd"/>
+            <w:r>
+              <w:t xml:space="preserve"> idea.</w:t>
             </w:r>
           </w:p>
           <w:p>
@@ -1848,7 +2038,7 @@
         <w:tc>
           <w:tcPr>
             <w:cnfStyle w:val="001000000000" w:firstRow="0" w:lastRow="0" w:firstColumn="1" w:lastColumn="0" w:oddVBand="0" w:evenVBand="0" w:oddHBand="0" w:evenHBand="0" w:firstRowFirstColumn="0" w:firstRowLastColumn="0" w:lastRowFirstColumn="0" w:lastRowLastColumn="0"/>
-            <w:tcW w:w="301" w:type="dxa"/>
+            <w:tcW w:w="460" w:type="dxa"/>
           </w:tcPr>
           <w:p>
             <w:pPr>
@@ -1861,7 +2051,36 @@
         </w:tc>
         <w:tc>
           <w:tcPr>
-            <w:tcW w:w="2010" w:type="dxa"/>
+            <w:tcW w:w="1991" w:type="dxa"/>
+          </w:tcPr>
+          <w:p>
+            <w:pPr>
+              <w:cnfStyle w:val="000000000000" w:firstRow="0" w:lastRow="0" w:firstColumn="0" w:lastColumn="0" w:oddVBand="0" w:evenVBand="0" w:oddHBand="0" w:evenHBand="0" w:firstRowFirstColumn="0" w:firstRowLastColumn="0" w:lastRowFirstColumn="0" w:lastRowLastColumn="0"/>
+            </w:pPr>
+            <w:proofErr w:type="spellStart"/>
+            <w:r>
+              <w:t>A</w:t>
+            </w:r>
+            <w:r>
+              <w:t>dministrative</w:t>
+            </w:r>
+            <w:proofErr w:type="spellEnd"/>
+            <w:r>
+              <w:t xml:space="preserve"> </w:t>
+            </w:r>
+            <w:proofErr w:type="spellStart"/>
+            <w:r>
+              <w:t>S</w:t>
+            </w:r>
+            <w:r>
+              <w:t>taff</w:t>
+            </w:r>
+            <w:proofErr w:type="spellEnd"/>
+          </w:p>
+        </w:tc>
+        <w:tc>
+          <w:tcPr>
+            <w:tcW w:w="6609" w:type="dxa"/>
           </w:tcPr>
           <w:p>
             <w:pPr>
@@ -1869,24 +2088,122 @@
               <w:cnfStyle w:val="000000000000" w:firstRow="0" w:lastRow="0" w:firstColumn="0" w:lastColumn="0" w:oddVBand="0" w:evenVBand="0" w:oddHBand="0" w:evenHBand="0" w:firstRowFirstColumn="0" w:firstRowLastColumn="0" w:lastRowFirstColumn="0" w:lastRowLastColumn="0"/>
             </w:pPr>
             <w:r>
-              <w:t>Owner</w:t>
-            </w:r>
-            <w:r>
-              <w:t>(CEO)</w:t>
-            </w:r>
-          </w:p>
-        </w:tc>
-        <w:tc>
-          <w:tcPr>
-            <w:tcW w:w="6899" w:type="dxa"/>
-          </w:tcPr>
-          <w:p>
-            <w:pPr>
-              <w:jc w:val="both"/>
-              <w:cnfStyle w:val="000000000000" w:firstRow="0" w:lastRow="0" w:firstColumn="0" w:lastColumn="0" w:oddVBand="0" w:evenVBand="0" w:oddHBand="0" w:evenHBand="0" w:firstRowFirstColumn="0" w:firstRowLastColumn="0" w:lastRowFirstColumn="0" w:lastRowLastColumn="0"/>
-            </w:pPr>
-            <w:r>
-              <w:t xml:space="preserve">They define the strategic goals and core vision of the platform. </w:t>
+              <w:t xml:space="preserve">They </w:t>
+            </w:r>
+            <w:proofErr w:type="spellStart"/>
+            <w:r>
+              <w:t>moderate</w:t>
+            </w:r>
+            <w:proofErr w:type="spellEnd"/>
+            <w:r>
+              <w:t xml:space="preserve"> </w:t>
+            </w:r>
+            <w:proofErr w:type="spellStart"/>
+            <w:r>
+              <w:t>the</w:t>
+            </w:r>
+            <w:proofErr w:type="spellEnd"/>
+            <w:r>
+              <w:t xml:space="preserve"> platform </w:t>
+            </w:r>
+            <w:proofErr w:type="spellStart"/>
+            <w:r>
+              <w:t>and</w:t>
+            </w:r>
+            <w:proofErr w:type="spellEnd"/>
+            <w:r>
+              <w:t xml:space="preserve"> </w:t>
+            </w:r>
+            <w:proofErr w:type="spellStart"/>
+            <w:r>
+              <w:t>resolve</w:t>
+            </w:r>
+            <w:proofErr w:type="spellEnd"/>
+            <w:r>
+              <w:t xml:space="preserve"> </w:t>
+            </w:r>
+            <w:proofErr w:type="spellStart"/>
+            <w:r>
+              <w:t>user-submitted</w:t>
+            </w:r>
+            <w:proofErr w:type="spellEnd"/>
+            <w:r>
+              <w:t xml:space="preserve"> </w:t>
+            </w:r>
+            <w:proofErr w:type="spellStart"/>
+            <w:r>
+              <w:t>disputes</w:t>
+            </w:r>
+            <w:proofErr w:type="spellEnd"/>
+            <w:r>
+              <w:t xml:space="preserve">. </w:t>
+            </w:r>
+            <w:proofErr w:type="spellStart"/>
+            <w:r>
+              <w:t>In</w:t>
+            </w:r>
+            <w:proofErr w:type="spellEnd"/>
+            <w:r>
+              <w:t xml:space="preserve"> </w:t>
+            </w:r>
+            <w:proofErr w:type="spellStart"/>
+            <w:r>
+              <w:t>case</w:t>
+            </w:r>
+            <w:proofErr w:type="spellEnd"/>
+            <w:r>
+              <w:t xml:space="preserve"> of Project </w:t>
+            </w:r>
+            <w:proofErr w:type="spellStart"/>
+            <w:r>
+              <w:t>success</w:t>
+            </w:r>
+            <w:proofErr w:type="spellEnd"/>
+            <w:r>
+              <w:t xml:space="preserve"> t</w:t>
+            </w:r>
+            <w:r>
+              <w:t xml:space="preserve">hey </w:t>
+            </w:r>
+            <w:proofErr w:type="spellStart"/>
+            <w:r>
+              <w:t>maintain</w:t>
+            </w:r>
+            <w:proofErr w:type="spellEnd"/>
+            <w:r>
+              <w:t xml:space="preserve"> </w:t>
+            </w:r>
+            <w:proofErr w:type="spellStart"/>
+            <w:r>
+              <w:t>their</w:t>
+            </w:r>
+            <w:proofErr w:type="spellEnd"/>
+            <w:r>
+              <w:t xml:space="preserve"> </w:t>
+            </w:r>
+            <w:proofErr w:type="spellStart"/>
+            <w:r>
+              <w:t>positions</w:t>
+            </w:r>
+            <w:proofErr w:type="spellEnd"/>
+            <w:r>
+              <w:t xml:space="preserve"> as </w:t>
+            </w:r>
+            <w:proofErr w:type="spellStart"/>
+            <w:r>
+              <w:t>the</w:t>
+            </w:r>
+            <w:proofErr w:type="spellEnd"/>
+            <w:r>
+              <w:t xml:space="preserve"> </w:t>
+            </w:r>
+            <w:proofErr w:type="spellStart"/>
+            <w:r>
+              <w:t>moderaters</w:t>
+            </w:r>
+            <w:proofErr w:type="spellEnd"/>
+            <w:r>
+              <w:t xml:space="preserve">. </w:t>
             </w:r>
             <w:proofErr w:type="spellStart"/>
             <w:r>
@@ -1906,25 +2223,11 @@
             </w:r>
             <w:proofErr w:type="spellStart"/>
             <w:r>
-              <w:t>results</w:t>
-            </w:r>
-            <w:proofErr w:type="spellEnd"/>
-            <w:r>
-              <w:t xml:space="preserve"> in </w:t>
-            </w:r>
-            <w:proofErr w:type="spellStart"/>
-            <w:r>
-              <w:t>success</w:t>
-            </w:r>
-            <w:proofErr w:type="spellEnd"/>
-            <w:r>
-              <w:t xml:space="preserve"> </w:t>
-            </w:r>
-            <w:r>
-              <w:t>t</w:t>
-            </w:r>
-            <w:r>
-              <w:t xml:space="preserve">hey </w:t>
+              <w:t>fails</w:t>
+            </w:r>
+            <w:proofErr w:type="spellEnd"/>
+            <w:r>
+              <w:t xml:space="preserve"> they </w:t>
             </w:r>
             <w:proofErr w:type="spellStart"/>
             <w:r>
@@ -1932,152 +2235,23 @@
             </w:r>
             <w:proofErr w:type="spellEnd"/>
             <w:r>
-              <w:t xml:space="preserve"> </w:t>
-            </w:r>
-            <w:proofErr w:type="spellStart"/>
-            <w:r>
-              <w:t>own</w:t>
-            </w:r>
-            <w:proofErr w:type="spellEnd"/>
-            <w:r>
-              <w:t xml:space="preserve"> a </w:t>
-            </w:r>
-            <w:proofErr w:type="spellStart"/>
-            <w:r>
-              <w:t>profitable</w:t>
-            </w:r>
-            <w:proofErr w:type="spellEnd"/>
-            <w:r>
-              <w:t xml:space="preserve"> </w:t>
-            </w:r>
-            <w:r>
-              <w:t xml:space="preserve">platform </w:t>
-            </w:r>
-            <w:proofErr w:type="spellStart"/>
-            <w:r>
-              <w:t>and</w:t>
-            </w:r>
-            <w:proofErr w:type="spellEnd"/>
-            <w:r>
-              <w:t xml:space="preserve"> a </w:t>
-            </w:r>
-            <w:proofErr w:type="spellStart"/>
-            <w:r>
-              <w:t>unique</w:t>
-            </w:r>
-            <w:proofErr w:type="spellEnd"/>
-            <w:r>
-              <w:t xml:space="preserve"> </w:t>
-            </w:r>
-            <w:proofErr w:type="spellStart"/>
-            <w:r>
-              <w:t>business</w:t>
-            </w:r>
-            <w:proofErr w:type="spellEnd"/>
-            <w:r>
-              <w:t xml:space="preserve"> model. </w:t>
-            </w:r>
-            <w:proofErr w:type="spellStart"/>
-            <w:r>
-              <w:t>If</w:t>
-            </w:r>
-            <w:proofErr w:type="spellEnd"/>
-            <w:r>
-              <w:t xml:space="preserve"> </w:t>
-            </w:r>
-            <w:proofErr w:type="spellStart"/>
-            <w:r>
-              <w:t>project</w:t>
-            </w:r>
-            <w:proofErr w:type="spellEnd"/>
-            <w:r>
-              <w:t xml:space="preserve"> </w:t>
-            </w:r>
-            <w:proofErr w:type="spellStart"/>
-            <w:r>
-              <w:t>fails</w:t>
-            </w:r>
-            <w:proofErr w:type="spellEnd"/>
-            <w:r>
-              <w:t xml:space="preserve"> t</w:t>
-            </w:r>
-            <w:r>
-              <w:t>hey</w:t>
-            </w:r>
-            <w:r>
-              <w:t xml:space="preserve"> </w:t>
-            </w:r>
-            <w:proofErr w:type="spellStart"/>
-            <w:r>
-              <w:t>will</w:t>
-            </w:r>
-            <w:proofErr w:type="spellEnd"/>
-            <w:r>
-              <w:t xml:space="preserve"> </w:t>
-            </w:r>
-            <w:proofErr w:type="spellStart"/>
-            <w:r>
-              <w:t>lose</w:t>
-            </w:r>
-            <w:proofErr w:type="spellEnd"/>
-            <w:r>
-              <w:t xml:space="preserve"> </w:t>
-            </w:r>
-            <w:proofErr w:type="spellStart"/>
-            <w:r>
-              <w:t>their</w:t>
-            </w:r>
-            <w:proofErr w:type="spellEnd"/>
-            <w:r>
-              <w:t xml:space="preserve"> </w:t>
-            </w:r>
-            <w:proofErr w:type="spellStart"/>
-            <w:r>
-              <w:t>competitive</w:t>
-            </w:r>
-            <w:proofErr w:type="spellEnd"/>
-            <w:r>
-              <w:t xml:space="preserve"> </w:t>
-            </w:r>
-            <w:proofErr w:type="spellStart"/>
-            <w:r>
-              <w:t>advantage</w:t>
-            </w:r>
-            <w:proofErr w:type="spellEnd"/>
-            <w:r>
-              <w:t xml:space="preserve"> </w:t>
-            </w:r>
-            <w:proofErr w:type="spellStart"/>
-            <w:r>
-              <w:t>and</w:t>
-            </w:r>
-            <w:proofErr w:type="spellEnd"/>
-            <w:r>
-              <w:t xml:space="preserve"> </w:t>
-            </w:r>
-            <w:proofErr w:type="spellStart"/>
-            <w:r>
-              <w:t>the</w:t>
-            </w:r>
-            <w:proofErr w:type="spellEnd"/>
-            <w:r>
-              <w:t xml:space="preserve"> </w:t>
-            </w:r>
-            <w:proofErr w:type="spellStart"/>
-            <w:r>
-              <w:t>value</w:t>
-            </w:r>
-            <w:proofErr w:type="spellEnd"/>
-            <w:r>
-              <w:t xml:space="preserve"> of </w:t>
-            </w:r>
-            <w:proofErr w:type="spellStart"/>
-            <w:r>
-              <w:t>their</w:t>
-            </w:r>
-            <w:proofErr w:type="spellEnd"/>
-            <w:r>
-              <w:t xml:space="preserve"> idea.</w:t>
+              <w:t xml:space="preserve"> be </w:t>
+            </w:r>
+            <w:proofErr w:type="spellStart"/>
+            <w:r>
+              <w:t>let</w:t>
+            </w:r>
+            <w:proofErr w:type="spellEnd"/>
+            <w:r>
+              <w:t xml:space="preserve"> </w:t>
+            </w:r>
+            <w:proofErr w:type="spellStart"/>
+            <w:r>
+              <w:t>go</w:t>
+            </w:r>
+            <w:proofErr w:type="spellEnd"/>
+            <w:r>
+              <w:t>.</w:t>
             </w:r>
           </w:p>
           <w:p>
@@ -2088,577 +2262,7 @@
           </w:p>
         </w:tc>
       </w:tr>
-      <w:tr>
-        <w:trPr>
-          <w:cnfStyle w:val="000000100000" w:firstRow="0" w:lastRow="0" w:firstColumn="0" w:lastColumn="0" w:oddVBand="0" w:evenVBand="0" w:oddHBand="1" w:evenHBand="0" w:firstRowFirstColumn="0" w:firstRowLastColumn="0" w:lastRowFirstColumn="0" w:lastRowLastColumn="0"/>
-          <w:trHeight w:val="657"/>
-        </w:trPr>
-        <w:tc>
-          <w:tcPr>
-            <w:cnfStyle w:val="001000000000" w:firstRow="0" w:lastRow="0" w:firstColumn="1" w:lastColumn="0" w:oddVBand="0" w:evenVBand="0" w:oddHBand="0" w:evenHBand="0" w:firstRowFirstColumn="0" w:firstRowLastColumn="0" w:lastRowFirstColumn="0" w:lastRowLastColumn="0"/>
-            <w:tcW w:w="301" w:type="dxa"/>
-          </w:tcPr>
-          <w:p>
-            <w:pPr>
-              <w:spacing w:line="720" w:lineRule="auto"/>
-            </w:pPr>
-            <w:r>
-              <w:t>9</w:t>
-            </w:r>
-          </w:p>
-        </w:tc>
-        <w:tc>
-          <w:tcPr>
-            <w:tcW w:w="2010" w:type="dxa"/>
-          </w:tcPr>
-          <w:p>
-            <w:pPr>
-              <w:jc w:val="both"/>
-              <w:cnfStyle w:val="000000100000" w:firstRow="0" w:lastRow="0" w:firstColumn="0" w:lastColumn="0" w:oddVBand="0" w:evenVBand="0" w:oddHBand="1" w:evenHBand="0" w:firstRowFirstColumn="0" w:firstRowLastColumn="0" w:lastRowFirstColumn="0" w:lastRowLastColumn="0"/>
-            </w:pPr>
-            <w:proofErr w:type="spellStart"/>
-            <w:r>
-              <w:t>A</w:t>
-            </w:r>
-            <w:r>
-              <w:t>dministrative</w:t>
-            </w:r>
-            <w:proofErr w:type="spellEnd"/>
-            <w:r>
-              <w:t xml:space="preserve"> </w:t>
-            </w:r>
-            <w:proofErr w:type="spellStart"/>
-            <w:r>
-              <w:t>S</w:t>
-            </w:r>
-            <w:r>
-              <w:t>taff</w:t>
-            </w:r>
-            <w:proofErr w:type="spellEnd"/>
-          </w:p>
-        </w:tc>
-        <w:tc>
-          <w:tcPr>
-            <w:tcW w:w="6899" w:type="dxa"/>
-          </w:tcPr>
-          <w:p>
-            <w:pPr>
-              <w:jc w:val="both"/>
-              <w:cnfStyle w:val="000000100000" w:firstRow="0" w:lastRow="0" w:firstColumn="0" w:lastColumn="0" w:oddVBand="0" w:evenVBand="0" w:oddHBand="1" w:evenHBand="0" w:firstRowFirstColumn="0" w:firstRowLastColumn="0" w:lastRowFirstColumn="0" w:lastRowLastColumn="0"/>
-            </w:pPr>
-            <w:r>
-              <w:t xml:space="preserve">They </w:t>
-            </w:r>
-            <w:proofErr w:type="spellStart"/>
-            <w:r>
-              <w:t>moderate</w:t>
-            </w:r>
-            <w:proofErr w:type="spellEnd"/>
-            <w:r>
-              <w:t xml:space="preserve"> </w:t>
-            </w:r>
-            <w:proofErr w:type="spellStart"/>
-            <w:r>
-              <w:t>the</w:t>
-            </w:r>
-            <w:proofErr w:type="spellEnd"/>
-            <w:r>
-              <w:t xml:space="preserve"> platform </w:t>
-            </w:r>
-            <w:proofErr w:type="spellStart"/>
-            <w:r>
-              <w:t>and</w:t>
-            </w:r>
-            <w:proofErr w:type="spellEnd"/>
-            <w:r>
-              <w:t xml:space="preserve"> </w:t>
-            </w:r>
-            <w:proofErr w:type="spellStart"/>
-            <w:r>
-              <w:t>resolve</w:t>
-            </w:r>
-            <w:proofErr w:type="spellEnd"/>
-            <w:r>
-              <w:t xml:space="preserve"> </w:t>
-            </w:r>
-            <w:proofErr w:type="spellStart"/>
-            <w:r>
-              <w:t>user-submitted</w:t>
-            </w:r>
-            <w:proofErr w:type="spellEnd"/>
-            <w:r>
-              <w:t xml:space="preserve"> </w:t>
-            </w:r>
-            <w:proofErr w:type="spellStart"/>
-            <w:r>
-              <w:t>disputes</w:t>
-            </w:r>
-            <w:proofErr w:type="spellEnd"/>
-            <w:r>
-              <w:t xml:space="preserve">. </w:t>
-            </w:r>
-            <w:proofErr w:type="spellStart"/>
-            <w:r>
-              <w:t>In</w:t>
-            </w:r>
-            <w:proofErr w:type="spellEnd"/>
-            <w:r>
-              <w:t xml:space="preserve"> </w:t>
-            </w:r>
-            <w:proofErr w:type="spellStart"/>
-            <w:r>
-              <w:t>case</w:t>
-            </w:r>
-            <w:proofErr w:type="spellEnd"/>
-            <w:r>
-              <w:t xml:space="preserve"> of Project </w:t>
-            </w:r>
-            <w:proofErr w:type="spellStart"/>
-            <w:r>
-              <w:t>success</w:t>
-            </w:r>
-            <w:proofErr w:type="spellEnd"/>
-            <w:r>
-              <w:t xml:space="preserve"> t</w:t>
-            </w:r>
-            <w:r>
-              <w:t xml:space="preserve">hey </w:t>
-            </w:r>
-            <w:proofErr w:type="spellStart"/>
-            <w:r>
-              <w:t>maintain</w:t>
-            </w:r>
-            <w:proofErr w:type="spellEnd"/>
-            <w:r>
-              <w:t xml:space="preserve"> </w:t>
-            </w:r>
-            <w:proofErr w:type="spellStart"/>
-            <w:r>
-              <w:t>their</w:t>
-            </w:r>
-            <w:proofErr w:type="spellEnd"/>
-            <w:r>
-              <w:t xml:space="preserve"> </w:t>
-            </w:r>
-            <w:proofErr w:type="spellStart"/>
-            <w:r>
-              <w:t>positions</w:t>
-            </w:r>
-            <w:proofErr w:type="spellEnd"/>
-            <w:r>
-              <w:t xml:space="preserve"> as </w:t>
-            </w:r>
-            <w:proofErr w:type="spellStart"/>
-            <w:r>
-              <w:t>the</w:t>
-            </w:r>
-            <w:proofErr w:type="spellEnd"/>
-            <w:r>
-              <w:t xml:space="preserve"> </w:t>
-            </w:r>
-            <w:proofErr w:type="spellStart"/>
-            <w:r>
-              <w:t>moderaters</w:t>
-            </w:r>
-            <w:proofErr w:type="spellEnd"/>
-            <w:r>
-              <w:t xml:space="preserve">. </w:t>
-            </w:r>
-            <w:proofErr w:type="spellStart"/>
-            <w:r>
-              <w:t>If</w:t>
-            </w:r>
-            <w:proofErr w:type="spellEnd"/>
-            <w:r>
-              <w:t xml:space="preserve"> </w:t>
-            </w:r>
-            <w:proofErr w:type="spellStart"/>
-            <w:r>
-              <w:t>project</w:t>
-            </w:r>
-            <w:proofErr w:type="spellEnd"/>
-            <w:r>
-              <w:t xml:space="preserve"> </w:t>
-            </w:r>
-            <w:proofErr w:type="spellStart"/>
-            <w:r>
-              <w:t>fails</w:t>
-            </w:r>
-            <w:proofErr w:type="spellEnd"/>
-            <w:r>
-              <w:t xml:space="preserve"> they </w:t>
-            </w:r>
-            <w:proofErr w:type="spellStart"/>
-            <w:r>
-              <w:t>will</w:t>
-            </w:r>
-            <w:proofErr w:type="spellEnd"/>
-            <w:r>
-              <w:t xml:space="preserve"> be </w:t>
-            </w:r>
-            <w:proofErr w:type="spellStart"/>
-            <w:r>
-              <w:t>let</w:t>
-            </w:r>
-            <w:proofErr w:type="spellEnd"/>
-            <w:r>
-              <w:t xml:space="preserve"> </w:t>
-            </w:r>
-            <w:proofErr w:type="spellStart"/>
-            <w:r>
-              <w:t>go</w:t>
-            </w:r>
-            <w:proofErr w:type="spellEnd"/>
-            <w:r>
-              <w:t>.</w:t>
-            </w:r>
-          </w:p>
-          <w:p>
-            <w:pPr>
-              <w:jc w:val="both"/>
-              <w:cnfStyle w:val="000000100000" w:firstRow="0" w:lastRow="0" w:firstColumn="0" w:lastColumn="0" w:oddVBand="0" w:evenVBand="0" w:oddHBand="1" w:evenHBand="0" w:firstRowFirstColumn="0" w:firstRowLastColumn="0" w:lastRowFirstColumn="0" w:lastRowLastColumn="0"/>
-            </w:pPr>
-          </w:p>
-        </w:tc>
-      </w:tr>
-      <w:tr>
-        <w:trPr>
-          <w:trHeight w:val="657"/>
-        </w:trPr>
-        <w:tc>
-          <w:tcPr>
-            <w:cnfStyle w:val="001000000000" w:firstRow="0" w:lastRow="0" w:firstColumn="1" w:lastColumn="0" w:oddVBand="0" w:evenVBand="0" w:oddHBand="0" w:evenHBand="0" w:firstRowFirstColumn="0" w:firstRowLastColumn="0" w:lastRowFirstColumn="0" w:lastRowLastColumn="0"/>
-            <w:tcW w:w="301" w:type="dxa"/>
-          </w:tcPr>
-          <w:p>
-            <w:pPr>
-              <w:spacing w:line="720" w:lineRule="auto"/>
-            </w:pPr>
-            <w:r>
-              <w:lastRenderedPageBreak/>
-              <w:t>10</w:t>
-            </w:r>
-          </w:p>
-        </w:tc>
-        <w:tc>
-          <w:tcPr>
-            <w:tcW w:w="2010" w:type="dxa"/>
-          </w:tcPr>
-          <w:p>
-            <w:pPr>
-              <w:jc w:val="both"/>
-              <w:cnfStyle w:val="000000000000" w:firstRow="0" w:lastRow="0" w:firstColumn="0" w:lastColumn="0" w:oddVBand="0" w:evenVBand="0" w:oddHBand="0" w:evenHBand="0" w:firstRowFirstColumn="0" w:firstRowLastColumn="0" w:lastRowFirstColumn="0" w:lastRowLastColumn="0"/>
-            </w:pPr>
-            <w:r>
-              <w:t>Suppliers</w:t>
-            </w:r>
-          </w:p>
-        </w:tc>
-        <w:tc>
-          <w:tcPr>
-            <w:tcW w:w="6899" w:type="dxa"/>
-          </w:tcPr>
-          <w:p>
-            <w:pPr>
-              <w:jc w:val="both"/>
-              <w:cnfStyle w:val="000000000000" w:firstRow="0" w:lastRow="0" w:firstColumn="0" w:lastColumn="0" w:oddVBand="0" w:evenVBand="0" w:oddHBand="0" w:evenHBand="0" w:firstRowFirstColumn="0" w:firstRowLastColumn="0" w:lastRowFirstColumn="0" w:lastRowLastColumn="0"/>
-            </w:pPr>
-            <w:r>
-              <w:t xml:space="preserve">They </w:t>
-            </w:r>
-            <w:proofErr w:type="spellStart"/>
-            <w:r>
-              <w:t>provide</w:t>
-            </w:r>
-            <w:proofErr w:type="spellEnd"/>
-            <w:r>
-              <w:t xml:space="preserve"> </w:t>
-            </w:r>
-            <w:proofErr w:type="spellStart"/>
-            <w:r>
-              <w:t>the</w:t>
-            </w:r>
-            <w:proofErr w:type="spellEnd"/>
-            <w:r>
-              <w:t xml:space="preserve"> </w:t>
-            </w:r>
-            <w:proofErr w:type="spellStart"/>
-            <w:r>
-              <w:t>required</w:t>
-            </w:r>
-            <w:proofErr w:type="spellEnd"/>
-            <w:r>
-              <w:t xml:space="preserve"> </w:t>
-            </w:r>
-            <w:proofErr w:type="spellStart"/>
-            <w:r>
-              <w:t>tools</w:t>
-            </w:r>
-            <w:proofErr w:type="spellEnd"/>
-            <w:r>
-              <w:t xml:space="preserve"> </w:t>
-            </w:r>
-            <w:proofErr w:type="spellStart"/>
-            <w:r>
-              <w:t>like</w:t>
-            </w:r>
-            <w:proofErr w:type="spellEnd"/>
-            <w:r>
-              <w:t xml:space="preserve"> </w:t>
-            </w:r>
-            <w:proofErr w:type="spellStart"/>
-            <w:r>
-              <w:t>cloud</w:t>
-            </w:r>
-            <w:proofErr w:type="spellEnd"/>
-            <w:r>
-              <w:t xml:space="preserve"> </w:t>
-            </w:r>
-            <w:proofErr w:type="spellStart"/>
-            <w:r>
-              <w:t>hosting</w:t>
-            </w:r>
-            <w:proofErr w:type="spellEnd"/>
-            <w:r>
-              <w:t xml:space="preserve"> </w:t>
-            </w:r>
-            <w:proofErr w:type="spellStart"/>
-            <w:r>
-              <w:t>and</w:t>
-            </w:r>
-            <w:proofErr w:type="spellEnd"/>
-            <w:r>
-              <w:t xml:space="preserve"> </w:t>
-            </w:r>
-            <w:proofErr w:type="spellStart"/>
-            <w:r>
-              <w:t>database</w:t>
-            </w:r>
-            <w:proofErr w:type="spellEnd"/>
-            <w:r>
-              <w:t xml:space="preserve"> </w:t>
-            </w:r>
-            <w:proofErr w:type="spellStart"/>
-            <w:r>
-              <w:t>management</w:t>
-            </w:r>
-            <w:proofErr w:type="spellEnd"/>
-            <w:r>
-              <w:t xml:space="preserve">. </w:t>
-            </w:r>
-            <w:proofErr w:type="spellStart"/>
-            <w:r>
-              <w:t>If</w:t>
-            </w:r>
-            <w:proofErr w:type="spellEnd"/>
-            <w:r>
-              <w:t xml:space="preserve"> </w:t>
-            </w:r>
-            <w:proofErr w:type="spellStart"/>
-            <w:r>
-              <w:t>project</w:t>
-            </w:r>
-            <w:proofErr w:type="spellEnd"/>
-            <w:r>
-              <w:t xml:space="preserve"> </w:t>
-            </w:r>
-            <w:r>
-              <w:t xml:space="preserve">is </w:t>
-            </w:r>
-            <w:proofErr w:type="spellStart"/>
-            <w:r>
-              <w:t>successful</w:t>
-            </w:r>
-            <w:proofErr w:type="spellEnd"/>
-            <w:r>
-              <w:t xml:space="preserve"> they </w:t>
-            </w:r>
-            <w:proofErr w:type="spellStart"/>
-            <w:r>
-              <w:t>will</w:t>
-            </w:r>
-            <w:proofErr w:type="spellEnd"/>
-            <w:r>
-              <w:t xml:space="preserve"> </w:t>
-            </w:r>
-            <w:proofErr w:type="spellStart"/>
-            <w:r>
-              <w:t>secure</w:t>
-            </w:r>
-            <w:proofErr w:type="spellEnd"/>
-            <w:r>
-              <w:t xml:space="preserve"> a </w:t>
-            </w:r>
-            <w:proofErr w:type="spellStart"/>
-            <w:r>
-              <w:t>long-term</w:t>
-            </w:r>
-            <w:proofErr w:type="spellEnd"/>
-            <w:r>
-              <w:t xml:space="preserve"> client and stable service revenue. </w:t>
-            </w:r>
-            <w:proofErr w:type="spellStart"/>
-            <w:r>
-              <w:t>If</w:t>
-            </w:r>
-            <w:proofErr w:type="spellEnd"/>
-            <w:r>
-              <w:t xml:space="preserve"> </w:t>
-            </w:r>
-            <w:proofErr w:type="spellStart"/>
-            <w:r>
-              <w:t>project</w:t>
-            </w:r>
-            <w:proofErr w:type="spellEnd"/>
-            <w:r>
-              <w:t xml:space="preserve"> </w:t>
-            </w:r>
-            <w:proofErr w:type="spellStart"/>
-            <w:r>
-              <w:t>fails</w:t>
-            </w:r>
-            <w:proofErr w:type="spellEnd"/>
-            <w:r>
-              <w:t xml:space="preserve"> they </w:t>
-            </w:r>
-            <w:proofErr w:type="spellStart"/>
-            <w:r>
-              <w:t>will</w:t>
-            </w:r>
-            <w:proofErr w:type="spellEnd"/>
-            <w:r>
-              <w:t xml:space="preserve"> </w:t>
-            </w:r>
-            <w:proofErr w:type="spellStart"/>
-            <w:r>
-              <w:t>lose</w:t>
-            </w:r>
-            <w:proofErr w:type="spellEnd"/>
-            <w:r>
-              <w:t xml:space="preserve"> a </w:t>
-            </w:r>
-            <w:proofErr w:type="spellStart"/>
-            <w:r>
-              <w:t>possible</w:t>
-            </w:r>
-            <w:proofErr w:type="spellEnd"/>
-            <w:r>
-              <w:t xml:space="preserve"> </w:t>
-            </w:r>
-            <w:proofErr w:type="spellStart"/>
-            <w:r>
-              <w:t>recurring</w:t>
-            </w:r>
-            <w:proofErr w:type="spellEnd"/>
-            <w:r>
-              <w:t xml:space="preserve"> </w:t>
-            </w:r>
-            <w:proofErr w:type="spellStart"/>
-            <w:r>
-              <w:t>income</w:t>
-            </w:r>
-            <w:proofErr w:type="spellEnd"/>
-            <w:r>
-              <w:t xml:space="preserve"> </w:t>
-            </w:r>
-            <w:proofErr w:type="spellStart"/>
-            <w:r>
-              <w:t>source</w:t>
-            </w:r>
-            <w:proofErr w:type="spellEnd"/>
-            <w:r>
-              <w:t>.</w:t>
-            </w:r>
-          </w:p>
-          <w:p>
-            <w:pPr>
-              <w:jc w:val="both"/>
-              <w:cnfStyle w:val="000000000000" w:firstRow="0" w:lastRow="0" w:firstColumn="0" w:lastColumn="0" w:oddVBand="0" w:evenVBand="0" w:oddHBand="0" w:evenHBand="0" w:firstRowFirstColumn="0" w:firstRowLastColumn="0" w:lastRowFirstColumn="0" w:lastRowLastColumn="0"/>
-            </w:pPr>
-          </w:p>
-        </w:tc>
-      </w:tr>
-      <w:tr>
-        <w:trPr>
-          <w:cnfStyle w:val="000000100000" w:firstRow="0" w:lastRow="0" w:firstColumn="0" w:lastColumn="0" w:oddVBand="0" w:evenVBand="0" w:oddHBand="1" w:evenHBand="0" w:firstRowFirstColumn="0" w:firstRowLastColumn="0" w:lastRowFirstColumn="0" w:lastRowLastColumn="0"/>
-          <w:trHeight w:val="657"/>
-        </w:trPr>
-        <w:tc>
-          <w:tcPr>
-            <w:cnfStyle w:val="001000000000" w:firstRow="0" w:lastRow="0" w:firstColumn="1" w:lastColumn="0" w:oddVBand="0" w:evenVBand="0" w:oddHBand="0" w:evenHBand="0" w:firstRowFirstColumn="0" w:firstRowLastColumn="0" w:lastRowFirstColumn="0" w:lastRowLastColumn="0"/>
-            <w:tcW w:w="301" w:type="dxa"/>
-          </w:tcPr>
-          <w:p>
-            <w:pPr>
-              <w:spacing w:line="720" w:lineRule="auto"/>
-            </w:pPr>
-            <w:r>
-              <w:t>11</w:t>
-            </w:r>
-          </w:p>
-        </w:tc>
-        <w:tc>
-          <w:tcPr>
-            <w:tcW w:w="2010" w:type="dxa"/>
-          </w:tcPr>
-          <w:p>
-            <w:pPr>
-              <w:spacing w:line="720" w:lineRule="auto"/>
-              <w:jc w:val="both"/>
-              <w:cnfStyle w:val="000000100000" w:firstRow="0" w:lastRow="0" w:firstColumn="0" w:lastColumn="0" w:oddVBand="0" w:evenVBand="0" w:oddHBand="1" w:evenHBand="0" w:firstRowFirstColumn="0" w:firstRowLastColumn="0" w:lastRowFirstColumn="0" w:lastRowLastColumn="0"/>
-            </w:pPr>
-          </w:p>
-        </w:tc>
-        <w:tc>
-          <w:tcPr>
-            <w:tcW w:w="6899" w:type="dxa"/>
-          </w:tcPr>
-          <w:p>
-            <w:pPr>
-              <w:jc w:val="both"/>
-              <w:cnfStyle w:val="000000100000" w:firstRow="0" w:lastRow="0" w:firstColumn="0" w:lastColumn="0" w:oddVBand="0" w:evenVBand="0" w:oddHBand="1" w:evenHBand="0" w:firstRowFirstColumn="0" w:firstRowLastColumn="0" w:lastRowFirstColumn="0" w:lastRowLastColumn="0"/>
-            </w:pPr>
-          </w:p>
-        </w:tc>
-      </w:tr>
-      <w:tr>
-        <w:trPr>
-          <w:trHeight w:val="657"/>
-        </w:trPr>
-        <w:tc>
-          <w:tcPr>
-            <w:cnfStyle w:val="001000000000" w:firstRow="0" w:lastRow="0" w:firstColumn="1" w:lastColumn="0" w:oddVBand="0" w:evenVBand="0" w:oddHBand="0" w:evenHBand="0" w:firstRowFirstColumn="0" w:firstRowLastColumn="0" w:lastRowFirstColumn="0" w:lastRowLastColumn="0"/>
-            <w:tcW w:w="301" w:type="dxa"/>
-          </w:tcPr>
-          <w:p>
-            <w:r>
-              <w:t>12</w:t>
-            </w:r>
-          </w:p>
-        </w:tc>
-        <w:tc>
-          <w:tcPr>
-            <w:tcW w:w="2010" w:type="dxa"/>
-          </w:tcPr>
-          <w:p>
-            <w:pPr>
-              <w:cnfStyle w:val="000000000000" w:firstRow="0" w:lastRow="0" w:firstColumn="0" w:lastColumn="0" w:oddVBand="0" w:evenVBand="0" w:oddHBand="0" w:evenHBand="0" w:firstRowFirstColumn="0" w:firstRowLastColumn="0" w:lastRowFirstColumn="0" w:lastRowLastColumn="0"/>
-            </w:pPr>
-          </w:p>
-        </w:tc>
-        <w:tc>
-          <w:tcPr>
-            <w:tcW w:w="6899" w:type="dxa"/>
-          </w:tcPr>
-          <w:p>
-            <w:pPr>
-              <w:cnfStyle w:val="000000000000" w:firstRow="0" w:lastRow="0" w:firstColumn="0" w:lastColumn="0" w:oddVBand="0" w:evenVBand="0" w:oddHBand="0" w:evenHBand="0" w:firstRowFirstColumn="0" w:firstRowLastColumn="0" w:lastRowFirstColumn="0" w:lastRowLastColumn="0"/>
-            </w:pPr>
-          </w:p>
-        </w:tc>
-      </w:tr>
     </w:tbl>
-    <w:p/>
     <w:p/>
     <w:p/>
     <w:p/>

</xml_diff>